<commit_message>
docs: corrige incongruencias de la primera parte (trazabilidad, protección de ramas, revisión del PR y jobs en rojo)
</commit_message>
<xml_diff>
--- a/docs/Actividad 2 - Pruebas del sistema de inventario.docx
+++ b/docs/Actividad 2 - Pruebas del sistema de inventario.docx
@@ -2776,7 +2776,7 @@
     </w:p>
     <w:p>
       <w:r>
-        <w:t>Cada requisito queda cubierto por al menos dos casos y de dos niveles distintos.</w:t>
+        <w:t>Cada requisito queda cubierto por al menos un caso. RF-01, RF-02 y RF-03 tienen casos de dos niveles o más; RF-04 y RF-05 se cubren con un caso de aceptación cada uno.</w:t>
       </w:r>
     </w:p>
     <w:tbl>
@@ -3909,7 +3909,6 @@
         <w:pStyle w:val="Ttulo1"/>
       </w:pPr>
       <w:r>
-        <w:lastRenderedPageBreak/>
         <w:t>4. Clasificar los casos como pruebas unitarias, de integración, de sistema o de aceptación.</w:t>
       </w:r>
     </w:p>
@@ -3923,7 +3922,7 @@
           <w:noProof/>
         </w:rPr>
         <w:drawing>
-          <wp:inline distT="0" distB="0" distL="0" distR="0" wp14:anchorId="2537E0E2" wp14:editId="6BBB0F19">
+          <wp:inline distT="0" distB="0" distL="0" distR="0" wp14:anchorId="601B5697" wp14:editId="13D5D758">
             <wp:extent cx="5580000" cy="3138750"/>
             <wp:effectExtent l="0" t="0" r="0" b="0"/>
             <wp:docPr id="1" name="Picture 1"/>
@@ -4438,7 +4437,6 @@
                 <w:color w:val="FFFFFF"/>
                 <w:sz w:val="18"/>
               </w:rPr>
-              <w:lastRenderedPageBreak/>
               <w:t>ID</w:t>
             </w:r>
           </w:p>
@@ -4608,7 +4606,7 @@
               <w:rPr>
                 <w:sz w:val="18"/>
               </w:rPr>
-              <w:t>0.004 s</w:t>
+              <w:t>0.008 s</w:t>
             </w:r>
           </w:p>
         </w:tc>
@@ -4701,7 +4699,7 @@
               <w:rPr>
                 <w:sz w:val="18"/>
               </w:rPr>
-              <w:t>0.000 s</w:t>
+              <w:t>0.001 s</w:t>
             </w:r>
           </w:p>
         </w:tc>
@@ -4794,7 +4792,7 @@
               <w:rPr>
                 <w:sz w:val="18"/>
               </w:rPr>
-              <w:t>0.000 s</w:t>
+              <w:t>0.001 s</w:t>
             </w:r>
           </w:p>
         </w:tc>
@@ -4887,7 +4885,7 @@
               <w:rPr>
                 <w:sz w:val="18"/>
               </w:rPr>
-              <w:t>0.000 s</w:t>
+              <w:t>0.001 s</w:t>
             </w:r>
           </w:p>
         </w:tc>
@@ -4980,7 +4978,7 @@
               <w:rPr>
                 <w:sz w:val="18"/>
               </w:rPr>
-              <w:t>0.007 s</w:t>
+              <w:t>0.009 s</w:t>
             </w:r>
           </w:p>
         </w:tc>
@@ -5073,7 +5071,7 @@
               <w:rPr>
                 <w:sz w:val="18"/>
               </w:rPr>
-              <w:t>0.001 s</w:t>
+              <w:t>0.002 s</w:t>
             </w:r>
           </w:p>
         </w:tc>
@@ -5166,7 +5164,7 @@
               <w:rPr>
                 <w:sz w:val="18"/>
               </w:rPr>
-              <w:t>0.926 s</w:t>
+              <w:t>0.889 s</w:t>
             </w:r>
           </w:p>
         </w:tc>
@@ -5259,7 +5257,7 @@
               <w:rPr>
                 <w:sz w:val="18"/>
               </w:rPr>
-              <w:t>0.922 s</w:t>
+              <w:t>0.865 s</w:t>
             </w:r>
           </w:p>
         </w:tc>
@@ -5352,7 +5350,7 @@
               <w:rPr>
                 <w:sz w:val="18"/>
               </w:rPr>
-              <w:t>0.949 s</w:t>
+              <w:t>0.880 s</w:t>
             </w:r>
           </w:p>
         </w:tc>
@@ -5440,7 +5438,7 @@
               <w:rPr>
                 <w:sz w:val="18"/>
               </w:rPr>
-              <w:t>0.888 s</w:t>
+              <w:t>0.872 s</w:t>
             </w:r>
           </w:p>
         </w:tc>
@@ -5459,7 +5457,7 @@
         <w:t xml:space="preserve">Resumen de la ronda 1: </w:t>
       </w:r>
       <w:r>
-        <w:t>10 casos ejecutados, 10 aprobados, 0 no aprobados; 43 aserciones en 3.697 s. Los casos de sistema y aceptación tardan cerca de un segundo porque cada uno levanta su propio servidor.</w:t>
+        <w:t>10 casos ejecutados, 10 aprobados, 0 no aprobados; 43 aserciones en 3.528 s. Los casos de sistema y aceptación tardan cerca de un segundo porque cada uno levanta su propio servidor.</w:t>
       </w:r>
     </w:p>
     <w:p>
@@ -5472,7 +5470,7 @@
           <w:noProof/>
         </w:rPr>
         <w:drawing>
-          <wp:inline distT="0" distB="0" distL="0" distR="0" wp14:anchorId="023F197D" wp14:editId="49C176FF">
+          <wp:inline distT="0" distB="0" distL="0" distR="0" wp14:anchorId="0DB30172" wp14:editId="274B27EA">
             <wp:extent cx="5940000" cy="3341250"/>
             <wp:effectExtent l="0" t="0" r="0" b="0"/>
             <wp:docPr id="2" name="Picture 2"/>
@@ -5530,9 +5528,8 @@
         <w:rPr>
           <w:noProof/>
         </w:rPr>
-        <w:lastRenderedPageBreak/>
         <w:drawing>
-          <wp:inline distT="0" distB="0" distL="0" distR="0" wp14:anchorId="1DFF0363" wp14:editId="5B31A2E9">
+          <wp:inline distT="0" distB="0" distL="0" distR="0" wp14:anchorId="09470A03" wp14:editId="0557CBF1">
             <wp:extent cx="5940000" cy="3341250"/>
             <wp:effectExtent l="0" t="0" r="0" b="0"/>
             <wp:docPr id="3" name="Picture 3"/>
@@ -5639,7 +5636,6 @@
         <w:pStyle w:val="Ttulo2"/>
       </w:pPr>
       <w:r>
-        <w:lastRenderedPageBreak/>
         <w:t>DEF-01 · La venta deja la existencia en negativo</w:t>
       </w:r>
     </w:p>
@@ -6044,7 +6040,7 @@
               <w:rPr>
                 <w:sz w:val="20"/>
               </w:rPr>
-              <w:t>Job «Unitarias» en rojo en GitHub Actions y el PR bloqueado.</w:t>
+              <w:t>Job «Unitarias» en rojo en GitHub Actions (los niveles siguientes no se ejecutan) y el PR bloqueado.</w:t>
             </w:r>
           </w:p>
           <w:p>
@@ -6172,7 +6168,6 @@
         <w:pStyle w:val="Ttulo2"/>
       </w:pPr>
       <w:r>
-        <w:lastRenderedPageBreak/>
         <w:t>DEF-02 · El reporte no marca para resurtir un producto que está justo en su mínimo</w:t>
       </w:r>
     </w:p>
@@ -6686,7 +6681,7 @@
     </w:p>
     <w:p>
       <w:r>
-        <w:t>Proponemos este ciclo para cada defecto. Los pasos 3 a 5 están automatizados.</w:t>
+        <w:t>Proponemos este ciclo para cada defecto. Los pasos 4, 5 y 7 los ejecuta GitHub Actions de forma automática.</w:t>
       </w:r>
     </w:p>
     <w:p>
@@ -6699,7 +6694,7 @@
           <w:noProof/>
         </w:rPr>
         <w:drawing>
-          <wp:inline distT="0" distB="0" distL="0" distR="0" wp14:anchorId="1A43BC75" wp14:editId="33A198FD">
+          <wp:inline distT="0" distB="0" distL="0" distR="0" wp14:anchorId="14378E88" wp14:editId="3263B0CD">
             <wp:extent cx="5580000" cy="3138750"/>
             <wp:effectExtent l="0" t="0" r="0" b="0"/>
             <wp:docPr id="4" name="Picture 4"/>
@@ -6756,7 +6751,6 @@
         <w:rPr>
           <w:b/>
         </w:rPr>
-        <w:lastRenderedPageBreak/>
         <w:t xml:space="preserve">Registro. </w:t>
       </w:r>
       <w:r>
@@ -6830,7 +6824,7 @@
         <w:t xml:space="preserve">Cierre. </w:t>
       </w:r>
       <w:r>
-        <w:t>Con todos los checks en verde, Emily aprueba el PR, se integra a develop y el defecto pasa a Cerrado en Trello. Para DEF-02, Ana revisa otra vez el reporte (CP-09).</w:t>
+        <w:t>Con todos los checks en verde, Emily revisa el PR, se integra a develop y el defecto pasa a Cerrado en Trello. Para DEF-02, Ana revisa otra vez el reporte (CP-09).</w:t>
       </w:r>
     </w:p>
     <w:p>
@@ -7271,7 +7265,7 @@
           <w:noProof/>
         </w:rPr>
         <w:drawing>
-          <wp:inline distT="0" distB="0" distL="0" distR="0" wp14:anchorId="5976FC7F" wp14:editId="44C18521">
+          <wp:inline distT="0" distB="0" distL="0" distR="0" wp14:anchorId="3582878F" wp14:editId="6B973FAE">
             <wp:extent cx="5940000" cy="3341250"/>
             <wp:effectExtent l="0" t="0" r="0" b="0"/>
             <wp:docPr id="5" name="Picture 5"/>
@@ -7325,7 +7319,6 @@
         <w:pStyle w:val="Ttulo1"/>
       </w:pPr>
       <w:r>
-        <w:lastRenderedPageBreak/>
         <w:t>8. Diseñar un flujo de integración continua para ejecutar automáticamente las pruebas cuando se actualice el repositorio.</w:t>
       </w:r>
     </w:p>
@@ -7415,7 +7408,7 @@
           <w:noProof/>
         </w:rPr>
         <w:drawing>
-          <wp:inline distT="0" distB="0" distL="0" distR="0" wp14:anchorId="4F1D1988" wp14:editId="2A694861">
+          <wp:inline distT="0" distB="0" distL="0" distR="0" wp14:anchorId="2472E209" wp14:editId="6656356E">
             <wp:extent cx="5940000" cy="3341250"/>
             <wp:effectExtent l="0" t="0" r="0" b="0"/>
             <wp:docPr id="6" name="Picture 6"/>
@@ -7473,9 +7466,8 @@
         <w:rPr>
           <w:noProof/>
         </w:rPr>
-        <w:lastRenderedPageBreak/>
         <w:drawing>
-          <wp:inline distT="0" distB="0" distL="0" distR="0" wp14:anchorId="240A8024" wp14:editId="41E2A2D2">
+          <wp:inline distT="0" distB="0" distL="0" distR="0" wp14:anchorId="144CA5B7" wp14:editId="5B7E0E68">
             <wp:extent cx="5940000" cy="3341250"/>
             <wp:effectExtent l="0" t="0" r="0" b="0"/>
             <wp:docPr id="7" name="Picture 7"/>
@@ -7964,7 +7956,7 @@
         <w:pStyle w:val="Listaconvietas"/>
       </w:pPr>
       <w:r>
-        <w:t>Protección de ramas en main y develop: no se permite push directo; todo entra por Pull Request con una revisión aprobada y con los checks de Unitarias, Integración, Sistema (HTTP), Aceptación y Regresión en verde.</w:t>
+        <w:t>Protección de ramas en main y develop (activa desde el 30 de octubre de 2026): no se permite push directo, ni siquiera al administrador; todo entra por Pull Request y GitHub no permite el merge si falla alguno de los 7 checks (Unitarias en PHP 8.2, 8.3 y 8.4, Integración, Sistema (HTTP), Aceptación y Regresión). GitHub no exige una aprobación porque el repositorio está en una sola cuenta; la revisión del PR le corresponde a Emily.</w:t>
       </w:r>
     </w:p>
     <w:p>
@@ -8062,7 +8054,6 @@
           <w:rFonts w:ascii="Consolas" w:eastAsia="Consolas" w:hAnsi="Consolas"/>
           <w:sz w:val="18"/>
         </w:rPr>
-        <w:lastRenderedPageBreak/>
         <w:t xml:space="preserve">    - cron: "0 7 * * *" # 01:00 en Campeche (UTC-6)</w:t>
       </w:r>
       <w:r>
@@ -8156,12 +8147,6 @@
           <w:sz w:val="18"/>
         </w:rPr>
         <w:br/>
-      </w:r>
-      <w:r>
-        <w:rPr>
-          <w:rFonts w:ascii="Consolas" w:eastAsia="Consolas" w:hAnsi="Consolas"/>
-          <w:sz w:val="18"/>
-        </w:rPr>
         <w:t xml:space="preserve">    name: Unitarias (PHP ${{ matrix.php }})</w:t>
       </w:r>
       <w:r>
@@ -8250,6 +8235,12 @@
           <w:sz w:val="18"/>
         </w:rPr>
         <w:br/>
+      </w:r>
+      <w:r>
+        <w:rPr>
+          <w:rFonts w:ascii="Consolas" w:eastAsia="Consolas" w:hAnsi="Consolas"/>
+          <w:sz w:val="18"/>
+        </w:rPr>
         <w:t xml:space="preserve">          php-version: ${{ matrix.php }}</w:t>
       </w:r>
       <w:r>
@@ -8304,12 +8295,6 @@
           <w:sz w:val="18"/>
         </w:rPr>
         <w:br/>
-      </w:r>
-      <w:r>
-        <w:rPr>
-          <w:rFonts w:ascii="Consolas" w:eastAsia="Consolas" w:hAnsi="Consolas"/>
-          <w:sz w:val="18"/>
-        </w:rPr>
         <w:t xml:space="preserve">        with:</w:t>
       </w:r>
       <w:r>
@@ -8785,31 +8770,31 @@
       </w:rPr>
     </w:lvl>
   </w:abstractNum>
-  <w:num w:numId="1" w16cid:durableId="40521975">
+  <w:num w:numId="1" w16cid:durableId="982931698">
     <w:abstractNumId w:val="8"/>
   </w:num>
-  <w:num w:numId="2" w16cid:durableId="1462724038">
+  <w:num w:numId="2" w16cid:durableId="676537067">
     <w:abstractNumId w:val="6"/>
   </w:num>
-  <w:num w:numId="3" w16cid:durableId="165288975">
+  <w:num w:numId="3" w16cid:durableId="1891650104">
     <w:abstractNumId w:val="5"/>
   </w:num>
-  <w:num w:numId="4" w16cid:durableId="1981761627">
+  <w:num w:numId="4" w16cid:durableId="1997296439">
     <w:abstractNumId w:val="4"/>
   </w:num>
-  <w:num w:numId="5" w16cid:durableId="681736723">
+  <w:num w:numId="5" w16cid:durableId="89130541">
     <w:abstractNumId w:val="7"/>
   </w:num>
-  <w:num w:numId="6" w16cid:durableId="632756221">
+  <w:num w:numId="6" w16cid:durableId="1490713403">
     <w:abstractNumId w:val="3"/>
   </w:num>
-  <w:num w:numId="7" w16cid:durableId="618299128">
+  <w:num w:numId="7" w16cid:durableId="2085176165">
     <w:abstractNumId w:val="2"/>
   </w:num>
-  <w:num w:numId="8" w16cid:durableId="266737425">
+  <w:num w:numId="8" w16cid:durableId="663751461">
     <w:abstractNumId w:val="1"/>
   </w:num>
-  <w:num w:numId="9" w16cid:durableId="1950114459">
+  <w:num w:numId="9" w16cid:durableId="1606958436">
     <w:abstractNumId w:val="0"/>
   </w:num>
 </w:numbering>

</xml_diff>